<commit_message>
DOCX References에 Amodei (2024, 2026) 추가
Co-Authored-By: Claude Opus 4.6 <noreply@anthropic.com>
</commit_message>
<xml_diff>
--- a/public/downloads/AI시대_새로운_사회계약을_위한_기초연구.docx
+++ b/public/downloads/AI시대_새로운_사회계약을_위한_기초연구.docx
@@ -435,7 +435,7 @@
                     <a:graphicData uri="http://schemas.openxmlformats.org/drawingml/2006/picture">
                       <pic:pic>
                         <pic:nvPicPr>
-                          <pic:cNvPr id="0" name="tmpftcxut4o.png"/>
+                          <pic:cNvPr id="0" name="tmpfipl9_3z.png"/>
                           <pic:cNvPicPr/>
                         </pic:nvPicPr>
                         <pic:blipFill>
@@ -567,7 +567,7 @@
                     <a:graphicData uri="http://schemas.openxmlformats.org/drawingml/2006/picture">
                       <pic:pic>
                         <pic:nvPicPr>
-                          <pic:cNvPr id="0" name="tmpevp57q2z.png"/>
+                          <pic:cNvPr id="0" name="tmpqzmx2xt0.png"/>
                           <pic:cNvPicPr/>
                         </pic:nvPicPr>
                         <pic:blipFill>
@@ -701,7 +701,7 @@
                     <a:graphicData uri="http://schemas.openxmlformats.org/drawingml/2006/picture">
                       <pic:pic>
                         <pic:nvPicPr>
-                          <pic:cNvPr id="0" name="tmp237cka7t.png"/>
+                          <pic:cNvPr id="0" name="tmpvso0i5tg.png"/>
                           <pic:cNvPicPr/>
                         </pic:nvPicPr>
                         <pic:blipFill>
@@ -833,7 +833,7 @@
                     <a:graphicData uri="http://schemas.openxmlformats.org/drawingml/2006/picture">
                       <pic:pic>
                         <pic:nvPicPr>
-                          <pic:cNvPr id="0" name="tmpuevgh3_z.png"/>
+                          <pic:cNvPr id="0" name="tmp_9lkdrr5.png"/>
                           <pic:cNvPicPr/>
                         </pic:nvPicPr>
                         <pic:blipFill>
@@ -1251,7 +1251,7 @@
                     <a:graphicData uri="http://schemas.openxmlformats.org/drawingml/2006/picture">
                       <pic:pic>
                         <pic:nvPicPr>
-                          <pic:cNvPr id="0" name="tmpvc6a4ggn.png"/>
+                          <pic:cNvPr id="0" name="tmphof3sqls.png"/>
                           <pic:cNvPicPr/>
                         </pic:nvPicPr>
                         <pic:blipFill>
@@ -1383,7 +1383,7 @@
                     <a:graphicData uri="http://schemas.openxmlformats.org/drawingml/2006/picture">
                       <pic:pic>
                         <pic:nvPicPr>
-                          <pic:cNvPr id="0" name="tmpyat3bfpp.png"/>
+                          <pic:cNvPr id="0" name="tmp34umvurc.png"/>
                           <pic:cNvPicPr/>
                         </pic:nvPicPr>
                         <pic:blipFill>
@@ -1517,7 +1517,7 @@
                     <a:graphicData uri="http://schemas.openxmlformats.org/drawingml/2006/picture">
                       <pic:pic>
                         <pic:nvPicPr>
-                          <pic:cNvPr id="0" name="tmpzpj6_0rm.png"/>
+                          <pic:cNvPr id="0" name="tmp13f9etfv.png"/>
                           <pic:cNvPicPr/>
                         </pic:nvPicPr>
                         <pic:blipFill>
@@ -1649,7 +1649,7 @@
                     <a:graphicData uri="http://schemas.openxmlformats.org/drawingml/2006/picture">
                       <pic:pic>
                         <pic:nvPicPr>
-                          <pic:cNvPr id="0" name="tmp2f8alre2.png"/>
+                          <pic:cNvPr id="0" name="tmpkm37n3yo.png"/>
                           <pic:cNvPicPr/>
                         </pic:nvPicPr>
                         <pic:blipFill>
@@ -1997,7 +1997,7 @@
                     <a:graphicData uri="http://schemas.openxmlformats.org/drawingml/2006/picture">
                       <pic:pic>
                         <pic:nvPicPr>
-                          <pic:cNvPr id="0" name="tmpydvc7p2_.png"/>
+                          <pic:cNvPr id="0" name="tmp76c7v1fi.png"/>
                           <pic:cNvPicPr/>
                         </pic:nvPicPr>
                         <pic:blipFill>
@@ -2114,7 +2114,7 @@
                     <a:graphicData uri="http://schemas.openxmlformats.org/drawingml/2006/picture">
                       <pic:pic>
                         <pic:nvPicPr>
-                          <pic:cNvPr id="0" name="tmpv8qk_3g4.png"/>
+                          <pic:cNvPr id="0" name="tmp9apgijzo.png"/>
                           <pic:cNvPicPr/>
                         </pic:nvPicPr>
                         <pic:blipFill>
@@ -2248,7 +2248,7 @@
                     <a:graphicData uri="http://schemas.openxmlformats.org/drawingml/2006/picture">
                       <pic:pic>
                         <pic:nvPicPr>
-                          <pic:cNvPr id="0" name="tmpbpqg6tv8.png"/>
+                          <pic:cNvPr id="0" name="tmps7hwyy5s.png"/>
                           <pic:cNvPicPr/>
                         </pic:nvPicPr>
                         <pic:blipFill>
@@ -2380,7 +2380,7 @@
                     <a:graphicData uri="http://schemas.openxmlformats.org/drawingml/2006/picture">
                       <pic:pic>
                         <pic:nvPicPr>
-                          <pic:cNvPr id="0" name="tmp1xu4veaz.png"/>
+                          <pic:cNvPr id="0" name="tmpz0thvjug.png"/>
                           <pic:cNvPicPr/>
                         </pic:nvPicPr>
                         <pic:blipFill>
@@ -2756,7 +2756,7 @@
                     <a:graphicData uri="http://schemas.openxmlformats.org/drawingml/2006/picture">
                       <pic:pic>
                         <pic:nvPicPr>
-                          <pic:cNvPr id="0" name="tmp99rcrs0v.png"/>
+                          <pic:cNvPr id="0" name="tmpald427nr.png"/>
                           <pic:cNvPicPr/>
                         </pic:nvPicPr>
                         <pic:blipFill>
@@ -2888,7 +2888,7 @@
                     <a:graphicData uri="http://schemas.openxmlformats.org/drawingml/2006/picture">
                       <pic:pic>
                         <pic:nvPicPr>
-                          <pic:cNvPr id="0" name="tmp1hehkn8k.png"/>
+                          <pic:cNvPr id="0" name="tmpa6hmmjg2.png"/>
                           <pic:cNvPicPr/>
                         </pic:nvPicPr>
                         <pic:blipFill>
@@ -3022,7 +3022,7 @@
                     <a:graphicData uri="http://schemas.openxmlformats.org/drawingml/2006/picture">
                       <pic:pic>
                         <pic:nvPicPr>
-                          <pic:cNvPr id="0" name="tmpromwz33i.png"/>
+                          <pic:cNvPr id="0" name="tmpf_3ekl9r.png"/>
                           <pic:cNvPicPr/>
                         </pic:nvPicPr>
                         <pic:blipFill>
@@ -3154,7 +3154,7 @@
                     <a:graphicData uri="http://schemas.openxmlformats.org/drawingml/2006/picture">
                       <pic:pic>
                         <pic:nvPicPr>
-                          <pic:cNvPr id="0" name="tmp1wv_ao44.png"/>
+                          <pic:cNvPr id="0" name="tmpicy26_53.png"/>
                           <pic:cNvPicPr/>
                         </pic:nvPicPr>
                         <pic:blipFill>
@@ -3978,7 +3978,7 @@
                     <a:graphicData uri="http://schemas.openxmlformats.org/drawingml/2006/picture">
                       <pic:pic>
                         <pic:nvPicPr>
-                          <pic:cNvPr id="0" name="tmpjfkygyds.png"/>
+                          <pic:cNvPr id="0" name="tmp20o6ygvh.png"/>
                           <pic:cNvPicPr/>
                         </pic:nvPicPr>
                         <pic:blipFill>
@@ -4110,7 +4110,7 @@
                     <a:graphicData uri="http://schemas.openxmlformats.org/drawingml/2006/picture">
                       <pic:pic>
                         <pic:nvPicPr>
-                          <pic:cNvPr id="0" name="tmp4nm_spwa.png"/>
+                          <pic:cNvPr id="0" name="tmpgsn599hm.png"/>
                           <pic:cNvPicPr/>
                         </pic:nvPicPr>
                         <pic:blipFill>
@@ -4244,7 +4244,7 @@
                     <a:graphicData uri="http://schemas.openxmlformats.org/drawingml/2006/picture">
                       <pic:pic>
                         <pic:nvPicPr>
-                          <pic:cNvPr id="0" name="tmpnr_f7jmi.png"/>
+                          <pic:cNvPr id="0" name="tmp1wmltkbf.png"/>
                           <pic:cNvPicPr/>
                         </pic:nvPicPr>
                         <pic:blipFill>
@@ -4376,7 +4376,7 @@
                     <a:graphicData uri="http://schemas.openxmlformats.org/drawingml/2006/picture">
                       <pic:pic>
                         <pic:nvPicPr>
-                          <pic:cNvPr id="0" name="tmp3dbz0jzz.png"/>
+                          <pic:cNvPr id="0" name="tmp_29y_a73.png"/>
                           <pic:cNvPicPr/>
                         </pic:nvPicPr>
                         <pic:blipFill>
@@ -7176,7 +7176,7 @@
           <w:b w:val="0"/>
           <w:sz w:val="20"/>
         </w:rPr>
-        <w:t>Anthropic. (2026, January 22). Claude’s new constitution. https://www.anthropic.com/news/claude-new-constitution</w:t>
+        <w:t>Amodei, D. (2024, October 17). Machines of loving grace. https://darioamodei.com/machines-of-loving-grace</w:t>
       </w:r>
     </w:p>
     <w:p>
@@ -7190,7 +7190,21 @@
           <w:b w:val="0"/>
           <w:sz w:val="20"/>
         </w:rPr>
-        <w:t>Bank of Korea. (2025). AI 확산과 청년고용 위축: 연공편향(seniority-biased) 기술변화를 중심으로 [BOK Issue Note No. 2025-30]. https://www.bok.or.kr/portal/bbs/P0002353/view.do?nttId=10094258</w:t>
+        <w:t>Amodei, D. (2026, February 3). The adolescence of technology. https://darioamodei.com/essay/the-adolescence-of-technology</w:t>
+      </w:r>
+    </w:p>
+    <w:p>
+      <w:pPr>
+        <w:spacing w:line="336" w:lineRule="auto" w:after="120"/>
+        <w:ind w:hanging="720" w:left="720"/>
+      </w:pPr>
+      <w:r>
+        <w:rPr>
+          <w:rFonts w:ascii="Asta Sans" w:hAnsi="Asta Sans" w:eastAsia="Asta Sans"/>
+          <w:b w:val="0"/>
+          <w:sz w:val="20"/>
+        </w:rPr>
+        <w:t>Anthropic. (2026, January 22). Claude’s new constitution. https://www.anthropic.com/news/claude-new-constitution</w:t>
       </w:r>
     </w:p>
     <w:p>
@@ -7222,6 +7236,20 @@
           <w:sz w:val="20"/>
         </w:rPr>
         <w:t>. MIT Press.</w:t>
+      </w:r>
+    </w:p>
+    <w:p>
+      <w:pPr>
+        <w:spacing w:line="336" w:lineRule="auto" w:after="120"/>
+        <w:ind w:hanging="720" w:left="720"/>
+      </w:pPr>
+      <w:r>
+        <w:rPr>
+          <w:rFonts w:ascii="Asta Sans" w:hAnsi="Asta Sans" w:eastAsia="Asta Sans"/>
+          <w:b w:val="0"/>
+          <w:sz w:val="20"/>
+        </w:rPr>
+        <w:t>Bank of Korea. (2025). AI 확산과 청년고용 위축: 연공편향(seniority-biased) 기술변화를 중심으로 [BOK Issue Note No. 2025-30]. https://www.bok.or.kr/portal/bbs/P0002353/view.do?nttId=10094258</w:t>
       </w:r>
     </w:p>
     <w:p>

</xml_diff>

<commit_message>
feat: AI Safety Levels (ASL) 섹션 추가 (웹+DOCX)
- ASL-1~5+ 등급 체계, BSL 비유, 현재 상태, 프레임워크 비교, 정책적 함의
- DOCX 부록 D로 추가, 웹사이트에 ASLView 컴포넌트 추가
- APA 참고문헌에 Anthropic RSP, ASL-3, Opus 4.6 보고서 추가

Co-Authored-By: Claude Opus 4.6 <noreply@anthropic.com>
</commit_message>
<xml_diff>
--- a/public/downloads/AI시대_새로운_사회계약을_위한_기초연구.docx
+++ b/public/downloads/AI시대_새로운_사회계약을_위한_기초연구.docx
@@ -435,7 +435,7 @@
                     <a:graphicData uri="http://schemas.openxmlformats.org/drawingml/2006/picture">
                       <pic:pic>
                         <pic:nvPicPr>
-                          <pic:cNvPr id="0" name="tmppj_jj6u4.png"/>
+                          <pic:cNvPr id="0" name="tmpoq3z4f5o.png"/>
                           <pic:cNvPicPr/>
                         </pic:nvPicPr>
                         <pic:blipFill>
@@ -567,7 +567,7 @@
                     <a:graphicData uri="http://schemas.openxmlformats.org/drawingml/2006/picture">
                       <pic:pic>
                         <pic:nvPicPr>
-                          <pic:cNvPr id="0" name="tmpop1l1ia9.png"/>
+                          <pic:cNvPr id="0" name="tmp_977faj_.png"/>
                           <pic:cNvPicPr/>
                         </pic:nvPicPr>
                         <pic:blipFill>
@@ -701,7 +701,7 @@
                     <a:graphicData uri="http://schemas.openxmlformats.org/drawingml/2006/picture">
                       <pic:pic>
                         <pic:nvPicPr>
-                          <pic:cNvPr id="0" name="tmp637ijl0p.png"/>
+                          <pic:cNvPr id="0" name="tmp3z6tsipz.png"/>
                           <pic:cNvPicPr/>
                         </pic:nvPicPr>
                         <pic:blipFill>
@@ -833,7 +833,7 @@
                     <a:graphicData uri="http://schemas.openxmlformats.org/drawingml/2006/picture">
                       <pic:pic>
                         <pic:nvPicPr>
-                          <pic:cNvPr id="0" name="tmp5rq_i5x_.png"/>
+                          <pic:cNvPr id="0" name="tmp8bymvekw.png"/>
                           <pic:cNvPicPr/>
                         </pic:nvPicPr>
                         <pic:blipFill>
@@ -1251,7 +1251,7 @@
                     <a:graphicData uri="http://schemas.openxmlformats.org/drawingml/2006/picture">
                       <pic:pic>
                         <pic:nvPicPr>
-                          <pic:cNvPr id="0" name="tmpqkj2ogss.png"/>
+                          <pic:cNvPr id="0" name="tmp20b3fne4.png"/>
                           <pic:cNvPicPr/>
                         </pic:nvPicPr>
                         <pic:blipFill>
@@ -1383,7 +1383,7 @@
                     <a:graphicData uri="http://schemas.openxmlformats.org/drawingml/2006/picture">
                       <pic:pic>
                         <pic:nvPicPr>
-                          <pic:cNvPr id="0" name="tmp7o5jj1vz.png"/>
+                          <pic:cNvPr id="0" name="tmppudvnaeo.png"/>
                           <pic:cNvPicPr/>
                         </pic:nvPicPr>
                         <pic:blipFill>
@@ -1517,7 +1517,7 @@
                     <a:graphicData uri="http://schemas.openxmlformats.org/drawingml/2006/picture">
                       <pic:pic>
                         <pic:nvPicPr>
-                          <pic:cNvPr id="0" name="tmpb0p2hshf.png"/>
+                          <pic:cNvPr id="0" name="tmp6gr1jwmm.png"/>
                           <pic:cNvPicPr/>
                         </pic:nvPicPr>
                         <pic:blipFill>
@@ -1649,7 +1649,7 @@
                     <a:graphicData uri="http://schemas.openxmlformats.org/drawingml/2006/picture">
                       <pic:pic>
                         <pic:nvPicPr>
-                          <pic:cNvPr id="0" name="tmppz3nhsxm.png"/>
+                          <pic:cNvPr id="0" name="tmpgi7x3ioi.png"/>
                           <pic:cNvPicPr/>
                         </pic:nvPicPr>
                         <pic:blipFill>
@@ -1997,7 +1997,7 @@
                     <a:graphicData uri="http://schemas.openxmlformats.org/drawingml/2006/picture">
                       <pic:pic>
                         <pic:nvPicPr>
-                          <pic:cNvPr id="0" name="tmp4evqjvoc.png"/>
+                          <pic:cNvPr id="0" name="tmp2_ia224d.png"/>
                           <pic:cNvPicPr/>
                         </pic:nvPicPr>
                         <pic:blipFill>
@@ -2114,7 +2114,7 @@
                     <a:graphicData uri="http://schemas.openxmlformats.org/drawingml/2006/picture">
                       <pic:pic>
                         <pic:nvPicPr>
-                          <pic:cNvPr id="0" name="tmpj6nebave.png"/>
+                          <pic:cNvPr id="0" name="tmp4squ8hbd.png"/>
                           <pic:cNvPicPr/>
                         </pic:nvPicPr>
                         <pic:blipFill>
@@ -2248,7 +2248,7 @@
                     <a:graphicData uri="http://schemas.openxmlformats.org/drawingml/2006/picture">
                       <pic:pic>
                         <pic:nvPicPr>
-                          <pic:cNvPr id="0" name="tmpuu6j7rye.png"/>
+                          <pic:cNvPr id="0" name="tmpellq8cid.png"/>
                           <pic:cNvPicPr/>
                         </pic:nvPicPr>
                         <pic:blipFill>
@@ -2380,7 +2380,7 @@
                     <a:graphicData uri="http://schemas.openxmlformats.org/drawingml/2006/picture">
                       <pic:pic>
                         <pic:nvPicPr>
-                          <pic:cNvPr id="0" name="tmp32wxf74f.png"/>
+                          <pic:cNvPr id="0" name="tmphqxnbse8.png"/>
                           <pic:cNvPicPr/>
                         </pic:nvPicPr>
                         <pic:blipFill>
@@ -2756,7 +2756,7 @@
                     <a:graphicData uri="http://schemas.openxmlformats.org/drawingml/2006/picture">
                       <pic:pic>
                         <pic:nvPicPr>
-                          <pic:cNvPr id="0" name="tmptp5rnon7.png"/>
+                          <pic:cNvPr id="0" name="tmpn4le3_09.png"/>
                           <pic:cNvPicPr/>
                         </pic:nvPicPr>
                         <pic:blipFill>
@@ -2888,7 +2888,7 @@
                     <a:graphicData uri="http://schemas.openxmlformats.org/drawingml/2006/picture">
                       <pic:pic>
                         <pic:nvPicPr>
-                          <pic:cNvPr id="0" name="tmpfwt6hm9e.png"/>
+                          <pic:cNvPr id="0" name="tmp7n8w_8fn.png"/>
                           <pic:cNvPicPr/>
                         </pic:nvPicPr>
                         <pic:blipFill>
@@ -3022,7 +3022,7 @@
                     <a:graphicData uri="http://schemas.openxmlformats.org/drawingml/2006/picture">
                       <pic:pic>
                         <pic:nvPicPr>
-                          <pic:cNvPr id="0" name="tmptdmb1zg3.png"/>
+                          <pic:cNvPr id="0" name="tmpdm28nh5e.png"/>
                           <pic:cNvPicPr/>
                         </pic:nvPicPr>
                         <pic:blipFill>
@@ -3154,7 +3154,7 @@
                     <a:graphicData uri="http://schemas.openxmlformats.org/drawingml/2006/picture">
                       <pic:pic>
                         <pic:nvPicPr>
-                          <pic:cNvPr id="0" name="tmpf8fij6mh.png"/>
+                          <pic:cNvPr id="0" name="tmpr4bzk7kw.png"/>
                           <pic:cNvPicPr/>
                         </pic:nvPicPr>
                         <pic:blipFill>
@@ -4216,7 +4216,7 @@
                     <a:graphicData uri="http://schemas.openxmlformats.org/drawingml/2006/picture">
                       <pic:pic>
                         <pic:nvPicPr>
-                          <pic:cNvPr id="0" name="tmp_632fzxa.png"/>
+                          <pic:cNvPr id="0" name="tmp4ftuqvoi.png"/>
                           <pic:cNvPicPr/>
                         </pic:nvPicPr>
                         <pic:blipFill>
@@ -4348,7 +4348,7 @@
                     <a:graphicData uri="http://schemas.openxmlformats.org/drawingml/2006/picture">
                       <pic:pic>
                         <pic:nvPicPr>
-                          <pic:cNvPr id="0" name="tmplbktp9wb.png"/>
+                          <pic:cNvPr id="0" name="tmpgag951y9.png"/>
                           <pic:cNvPicPr/>
                         </pic:nvPicPr>
                         <pic:blipFill>
@@ -4482,7 +4482,7 @@
                     <a:graphicData uri="http://schemas.openxmlformats.org/drawingml/2006/picture">
                       <pic:pic>
                         <pic:nvPicPr>
-                          <pic:cNvPr id="0" name="tmp1il86_9q.png"/>
+                          <pic:cNvPr id="0" name="tmpi7763zjp.png"/>
                           <pic:cNvPicPr/>
                         </pic:nvPicPr>
                         <pic:blipFill>
@@ -4614,7 +4614,7 @@
                     <a:graphicData uri="http://schemas.openxmlformats.org/drawingml/2006/picture">
                       <pic:pic>
                         <pic:nvPicPr>
-                          <pic:cNvPr id="0" name="tmpjwh_5e38.png"/>
+                          <pic:cNvPr id="0" name="tmp98y4hah8.png"/>
                           <pic:cNvPicPr/>
                         </pic:nvPicPr>
                         <pic:blipFill>
@@ -7352,6 +7352,1280 @@
     </w:p>
     <w:p>
       <w:pPr>
+        <w:spacing w:before="0" w:after="400"/>
+      </w:pPr>
+      <w:r>
+        <w:rPr>
+          <w:rFonts w:ascii="Asta Sans" w:hAnsi="Asta Sans" w:eastAsia="Asta Sans"/>
+          <w:b/>
+          <w:color w:val="000000"/>
+          <w:sz w:val="44"/>
+        </w:rPr>
+        <w:t>부록 D: AI Safety Levels (ASL)</w:t>
+      </w:r>
+    </w:p>
+    <w:p>
+      <w:pPr>
+        <w:spacing w:after="320"/>
+        <w:pBdr>
+          <w:bottom w:val="single" w:sz="4" w:space="1" w:color="333333"/>
+        </w:pBdr>
+      </w:pPr>
+    </w:p>
+    <w:p>
+      <w:pPr>
+        <w:spacing w:line="360" w:lineRule="auto" w:after="160"/>
+        <w:ind w:firstLine="283"/>
+      </w:pPr>
+      <w:r>
+        <w:rPr>
+          <w:rFonts w:ascii="Asta Sans" w:hAnsi="Asta Sans" w:eastAsia="Asta Sans"/>
+          <w:b w:val="0"/>
+          <w:sz w:val="22"/>
+        </w:rPr>
+        <w:t>AI Safety Levels(ASL)는 Anthropic이 자사의 책임 있는 확장 정책(Responsible Scaling Policy, RSP) 내에서 정의한 AI 안전 등급 체계다. 2023년 9월 RSP v1.0으로 최초 발표되었고, 2025년 5월 v2.2까지 업데이트되었다. 핵심 원리는 비례적 보호(proportional protection)로, AI 모델의 역량이 증가함에 따라 안전 조치도 비례하여 강화되어야 한다는 것이다. 미국 정부의 생물안전등급(Biosafety Level, BSL) 체계에서 영감을 받아 설계되었다.</w:t>
+      </w:r>
+    </w:p>
+    <w:p>
+      <w:pPr>
+        <w:spacing w:before="280" w:after="160"/>
+      </w:pPr>
+      <w:r>
+        <w:rPr>
+          <w:rFonts w:ascii="Asta Sans" w:hAnsi="Asta Sans" w:eastAsia="Asta Sans"/>
+          <w:b/>
+          <w:color w:val="444444"/>
+          <w:sz w:val="26"/>
+        </w:rPr>
+        <w:t>1. ASL 등급 체계</w:t>
+      </w:r>
+    </w:p>
+    <w:tbl>
+      <w:tblPr>
+        <w:tblStyle w:val="TableGrid"/>
+        <w:tblW w:type="auto" w:w="0"/>
+        <w:tblLook w:firstColumn="1" w:firstRow="1" w:lastColumn="0" w:lastRow="0" w:noHBand="0" w:noVBand="1" w:val="04A0"/>
+      </w:tblPr>
+      <w:tblGrid>
+        <w:gridCol w:w="1881"/>
+        <w:gridCol w:w="1881"/>
+        <w:gridCol w:w="1881"/>
+        <w:gridCol w:w="1881"/>
+        <w:gridCol w:w="1881"/>
+      </w:tblGrid>
+      <w:tr>
+        <w:tc>
+          <w:tcPr>
+            <w:tcW w:type="dxa" w:w="850"/>
+            <w:shd w:fill="333333" w:val="clear"/>
+          </w:tcPr>
+          <w:p>
+            <w:r/>
+            <w:r>
+              <w:rPr>
+                <w:rFonts w:ascii="Asta Sans" w:hAnsi="Asta Sans" w:eastAsia="Asta Sans"/>
+                <w:b/>
+                <w:color w:val="FFFFFF"/>
+                <w:sz w:val="18"/>
+              </w:rPr>
+              <w:t>등급</w:t>
+            </w:r>
+          </w:p>
+        </w:tc>
+        <w:tc>
+          <w:tcPr>
+            <w:tcW w:type="dxa" w:w="1417"/>
+            <w:shd w:fill="333333" w:val="clear"/>
+          </w:tcPr>
+          <w:p>
+            <w:r/>
+            <w:r>
+              <w:rPr>
+                <w:rFonts w:ascii="Asta Sans" w:hAnsi="Asta Sans" w:eastAsia="Asta Sans"/>
+                <w:b/>
+                <w:color w:val="FFFFFF"/>
+                <w:sz w:val="18"/>
+              </w:rPr>
+              <w:t>제목</w:t>
+            </w:r>
+          </w:p>
+        </w:tc>
+        <w:tc>
+          <w:tcPr>
+            <w:tcW w:type="dxa" w:w="2835"/>
+            <w:shd w:fill="333333" w:val="clear"/>
+          </w:tcPr>
+          <w:p>
+            <w:r/>
+            <w:r>
+              <w:rPr>
+                <w:rFonts w:ascii="Asta Sans" w:hAnsi="Asta Sans" w:eastAsia="Asta Sans"/>
+                <w:b/>
+                <w:color w:val="FFFFFF"/>
+                <w:sz w:val="18"/>
+              </w:rPr>
+              <w:t>AI 역량 기준</w:t>
+            </w:r>
+          </w:p>
+        </w:tc>
+        <w:tc>
+          <w:tcPr>
+            <w:tcW w:type="dxa" w:w="2835"/>
+            <w:shd w:fill="333333" w:val="clear"/>
+          </w:tcPr>
+          <w:p>
+            <w:r/>
+            <w:r>
+              <w:rPr>
+                <w:rFonts w:ascii="Asta Sans" w:hAnsi="Asta Sans" w:eastAsia="Asta Sans"/>
+                <w:b/>
+                <w:color w:val="FFFFFF"/>
+                <w:sz w:val="18"/>
+              </w:rPr>
+              <w:t>안전 조치</w:t>
+            </w:r>
+          </w:p>
+        </w:tc>
+        <w:tc>
+          <w:tcPr>
+            <w:tcW w:type="dxa" w:w="1417"/>
+            <w:shd w:fill="333333" w:val="clear"/>
+          </w:tcPr>
+          <w:p>
+            <w:r/>
+            <w:r>
+              <w:rPr>
+                <w:rFonts w:ascii="Asta Sans" w:hAnsi="Asta Sans" w:eastAsia="Asta Sans"/>
+                <w:b/>
+                <w:color w:val="FFFFFF"/>
+                <w:sz w:val="18"/>
+              </w:rPr>
+              <w:t>BSL 대응</w:t>
+            </w:r>
+          </w:p>
+        </w:tc>
+      </w:tr>
+      <w:tr>
+        <w:tc>
+          <w:tcPr>
+            <w:tcW w:type="dxa" w:w="850"/>
+          </w:tcPr>
+          <w:p>
+            <w:pPr>
+              <w:spacing w:line="312" w:lineRule="auto"/>
+            </w:pPr>
+            <w:r/>
+            <w:r>
+              <w:rPr>
+                <w:rFonts w:ascii="Asta Sans" w:hAnsi="Asta Sans" w:eastAsia="Asta Sans"/>
+                <w:b/>
+                <w:sz w:val="18"/>
+              </w:rPr>
+              <w:t>ASL-1</w:t>
+            </w:r>
+          </w:p>
+        </w:tc>
+        <w:tc>
+          <w:tcPr>
+            <w:tcW w:type="dxa" w:w="1417"/>
+          </w:tcPr>
+          <w:p>
+            <w:pPr>
+              <w:spacing w:line="312" w:lineRule="auto"/>
+            </w:pPr>
+            <w:r/>
+            <w:r>
+              <w:rPr>
+                <w:rFonts w:ascii="Asta Sans" w:hAnsi="Asta Sans" w:eastAsia="Asta Sans"/>
+                <w:b w:val="0"/>
+                <w:sz w:val="18"/>
+              </w:rPr>
+              <w:t>무의미한 위험</w:t>
+            </w:r>
+          </w:p>
+        </w:tc>
+        <w:tc>
+          <w:tcPr>
+            <w:tcW w:type="dxa" w:w="2835"/>
+          </w:tcPr>
+          <w:p>
+            <w:pPr>
+              <w:spacing w:line="312" w:lineRule="auto"/>
+            </w:pPr>
+            <w:r/>
+            <w:r>
+              <w:rPr>
+                <w:rFonts w:ascii="Asta Sans" w:hAnsi="Asta Sans" w:eastAsia="Asta Sans"/>
+                <w:b w:val="0"/>
+                <w:sz w:val="18"/>
+              </w:rPr>
+              <w:t>의미 있는 재앙적 위험을 제기하지 않는 시스템</w:t>
+            </w:r>
+          </w:p>
+        </w:tc>
+        <w:tc>
+          <w:tcPr>
+            <w:tcW w:type="dxa" w:w="2835"/>
+          </w:tcPr>
+          <w:p>
+            <w:pPr>
+              <w:spacing w:line="312" w:lineRule="auto"/>
+            </w:pPr>
+            <w:r/>
+            <w:r>
+              <w:rPr>
+                <w:rFonts w:ascii="Asta Sans" w:hAnsi="Asta Sans" w:eastAsia="Asta Sans"/>
+                <w:b w:val="0"/>
+                <w:sz w:val="18"/>
+              </w:rPr>
+              <w:t>특별한 안전 조치 불필요</w:t>
+            </w:r>
+          </w:p>
+        </w:tc>
+        <w:tc>
+          <w:tcPr>
+            <w:tcW w:type="dxa" w:w="1417"/>
+          </w:tcPr>
+          <w:p>
+            <w:pPr>
+              <w:spacing w:line="312" w:lineRule="auto"/>
+            </w:pPr>
+            <w:r/>
+            <w:r>
+              <w:rPr>
+                <w:rFonts w:ascii="Asta Sans" w:hAnsi="Asta Sans" w:eastAsia="Asta Sans"/>
+                <w:b w:val="0"/>
+                <w:sz w:val="18"/>
+              </w:rPr>
+              <w:t>BSL-1</w:t>
+            </w:r>
+          </w:p>
+        </w:tc>
+      </w:tr>
+      <w:tr>
+        <w:tc>
+          <w:tcPr>
+            <w:tcW w:type="dxa" w:w="850"/>
+          </w:tcPr>
+          <w:p>
+            <w:pPr>
+              <w:spacing w:line="312" w:lineRule="auto"/>
+            </w:pPr>
+            <w:r/>
+            <w:r>
+              <w:rPr>
+                <w:rFonts w:ascii="Asta Sans" w:hAnsi="Asta Sans" w:eastAsia="Asta Sans"/>
+                <w:b/>
+                <w:sz w:val="18"/>
+              </w:rPr>
+              <w:t>ASL-2</w:t>
+            </w:r>
+          </w:p>
+        </w:tc>
+        <w:tc>
+          <w:tcPr>
+            <w:tcW w:type="dxa" w:w="1417"/>
+          </w:tcPr>
+          <w:p>
+            <w:pPr>
+              <w:spacing w:line="312" w:lineRule="auto"/>
+            </w:pPr>
+            <w:r/>
+            <w:r>
+              <w:rPr>
+                <w:rFonts w:ascii="Asta Sans" w:hAnsi="Asta Sans" w:eastAsia="Asta Sans"/>
+                <w:b w:val="0"/>
+                <w:sz w:val="18"/>
+              </w:rPr>
+              <w:t>초기 위험 징후</w:t>
+            </w:r>
+          </w:p>
+        </w:tc>
+        <w:tc>
+          <w:tcPr>
+            <w:tcW w:type="dxa" w:w="2835"/>
+          </w:tcPr>
+          <w:p>
+            <w:pPr>
+              <w:spacing w:line="312" w:lineRule="auto"/>
+            </w:pPr>
+            <w:r/>
+            <w:r>
+              <w:rPr>
+                <w:rFonts w:ascii="Asta Sans" w:hAnsi="Asta Sans" w:eastAsia="Asta Sans"/>
+                <w:b w:val="0"/>
+                <w:sz w:val="18"/>
+              </w:rPr>
+              <w:t>CBRN 관련 지침 제공이 가능하나 검색 엔진/교과서 수준</w:t>
+            </w:r>
+          </w:p>
+        </w:tc>
+        <w:tc>
+          <w:tcPr>
+            <w:tcW w:type="dxa" w:w="2835"/>
+          </w:tcPr>
+          <w:p>
+            <w:pPr>
+              <w:spacing w:line="312" w:lineRule="auto"/>
+            </w:pPr>
+            <w:r/>
+            <w:r>
+              <w:rPr>
+                <w:rFonts w:ascii="Asta Sans" w:hAnsi="Asta Sans" w:eastAsia="Asta Sans"/>
+                <w:b w:val="0"/>
+                <w:sz w:val="18"/>
+              </w:rPr>
+              <w:t>CBRN 요청 거부 훈련, 가중치 탈취 방어</w:t>
+            </w:r>
+          </w:p>
+        </w:tc>
+        <w:tc>
+          <w:tcPr>
+            <w:tcW w:type="dxa" w:w="1417"/>
+          </w:tcPr>
+          <w:p>
+            <w:pPr>
+              <w:spacing w:line="312" w:lineRule="auto"/>
+            </w:pPr>
+            <w:r/>
+            <w:r>
+              <w:rPr>
+                <w:rFonts w:ascii="Asta Sans" w:hAnsi="Asta Sans" w:eastAsia="Asta Sans"/>
+                <w:b w:val="0"/>
+                <w:sz w:val="18"/>
+              </w:rPr>
+              <w:t>BSL-2</w:t>
+            </w:r>
+          </w:p>
+        </w:tc>
+      </w:tr>
+      <w:tr>
+        <w:tc>
+          <w:tcPr>
+            <w:tcW w:type="dxa" w:w="850"/>
+          </w:tcPr>
+          <w:p>
+            <w:pPr>
+              <w:spacing w:line="312" w:lineRule="auto"/>
+            </w:pPr>
+            <w:r/>
+            <w:r>
+              <w:rPr>
+                <w:rFonts w:ascii="Asta Sans" w:hAnsi="Asta Sans" w:eastAsia="Asta Sans"/>
+                <w:b/>
+                <w:sz w:val="18"/>
+              </w:rPr>
+              <w:t>ASL-3</w:t>
+            </w:r>
+          </w:p>
+        </w:tc>
+        <w:tc>
+          <w:tcPr>
+            <w:tcW w:type="dxa" w:w="1417"/>
+          </w:tcPr>
+          <w:p>
+            <w:pPr>
+              <w:spacing w:line="312" w:lineRule="auto"/>
+            </w:pPr>
+            <w:r/>
+            <w:r>
+              <w:rPr>
+                <w:rFonts w:ascii="Asta Sans" w:hAnsi="Asta Sans" w:eastAsia="Asta Sans"/>
+                <w:b w:val="0"/>
+                <w:sz w:val="18"/>
+              </w:rPr>
+              <w:t>실질적 위험 증가</w:t>
+            </w:r>
+          </w:p>
+        </w:tc>
+        <w:tc>
+          <w:tcPr>
+            <w:tcW w:type="dxa" w:w="2835"/>
+          </w:tcPr>
+          <w:p>
+            <w:pPr>
+              <w:spacing w:line="312" w:lineRule="auto"/>
+            </w:pPr>
+            <w:r/>
+            <w:r>
+              <w:rPr>
+                <w:rFonts w:ascii="Asta Sans" w:hAnsi="Asta Sans" w:eastAsia="Asta Sans"/>
+                <w:b w:val="0"/>
+                <w:sz w:val="18"/>
+              </w:rPr>
+              <w:t>CBRN 위험을 실질적으로 증가시키거나 초기 자율 행동 역량</w:t>
+            </w:r>
+          </w:p>
+        </w:tc>
+        <w:tc>
+          <w:tcPr>
+            <w:tcW w:type="dxa" w:w="2835"/>
+          </w:tcPr>
+          <w:p>
+            <w:pPr>
+              <w:spacing w:line="312" w:lineRule="auto"/>
+            </w:pPr>
+            <w:r/>
+            <w:r>
+              <w:rPr>
+                <w:rFonts w:ascii="Asta Sans" w:hAnsi="Asta Sans" w:eastAsia="Asta Sans"/>
+                <w:b w:val="0"/>
+                <w:sz w:val="18"/>
+              </w:rPr>
+              <w:t>Constitutional Classifiers, 100+ 보안 통제, 이중 인증</w:t>
+            </w:r>
+          </w:p>
+        </w:tc>
+        <w:tc>
+          <w:tcPr>
+            <w:tcW w:type="dxa" w:w="1417"/>
+          </w:tcPr>
+          <w:p>
+            <w:pPr>
+              <w:spacing w:line="312" w:lineRule="auto"/>
+            </w:pPr>
+            <w:r/>
+            <w:r>
+              <w:rPr>
+                <w:rFonts w:ascii="Asta Sans" w:hAnsi="Asta Sans" w:eastAsia="Asta Sans"/>
+                <w:b w:val="0"/>
+                <w:sz w:val="18"/>
+              </w:rPr>
+              <w:t>BSL-3</w:t>
+            </w:r>
+          </w:p>
+        </w:tc>
+      </w:tr>
+      <w:tr>
+        <w:tc>
+          <w:tcPr>
+            <w:tcW w:type="dxa" w:w="850"/>
+          </w:tcPr>
+          <w:p>
+            <w:pPr>
+              <w:spacing w:line="312" w:lineRule="auto"/>
+            </w:pPr>
+            <w:r/>
+            <w:r>
+              <w:rPr>
+                <w:rFonts w:ascii="Asta Sans" w:hAnsi="Asta Sans" w:eastAsia="Asta Sans"/>
+                <w:b/>
+                <w:sz w:val="18"/>
+              </w:rPr>
+              <w:t>ASL-4</w:t>
+            </w:r>
+          </w:p>
+        </w:tc>
+        <w:tc>
+          <w:tcPr>
+            <w:tcW w:type="dxa" w:w="1417"/>
+          </w:tcPr>
+          <w:p>
+            <w:pPr>
+              <w:spacing w:line="312" w:lineRule="auto"/>
+            </w:pPr>
+            <w:r/>
+            <w:r>
+              <w:rPr>
+                <w:rFonts w:ascii="Asta Sans" w:hAnsi="Asta Sans" w:eastAsia="Asta Sans"/>
+                <w:b w:val="0"/>
+                <w:sz w:val="18"/>
+              </w:rPr>
+              <w:t>고도 위험 (연구 단계)</w:t>
+            </w:r>
+          </w:p>
+        </w:tc>
+        <w:tc>
+          <w:tcPr>
+            <w:tcW w:type="dxa" w:w="2835"/>
+          </w:tcPr>
+          <w:p>
+            <w:pPr>
+              <w:spacing w:line="312" w:lineRule="auto"/>
+            </w:pPr>
+            <w:r/>
+            <w:r>
+              <w:rPr>
+                <w:rFonts w:ascii="Asta Sans" w:hAnsi="Asta Sans" w:eastAsia="Asta Sans"/>
+                <w:b w:val="0"/>
+                <w:sz w:val="18"/>
+              </w:rPr>
+              <w:t>국가 안보 수준의 사이버/생물 위협, 자율 복제 가능</w:t>
+            </w:r>
+          </w:p>
+        </w:tc>
+        <w:tc>
+          <w:tcPr>
+            <w:tcW w:type="dxa" w:w="2835"/>
+          </w:tcPr>
+          <w:p>
+            <w:pPr>
+              <w:spacing w:line="312" w:lineRule="auto"/>
+            </w:pPr>
+            <w:r/>
+            <w:r>
+              <w:rPr>
+                <w:rFonts w:ascii="Asta Sans" w:hAnsi="Asta Sans" w:eastAsia="Asta Sans"/>
+                <w:b w:val="0"/>
+                <w:sz w:val="18"/>
+              </w:rPr>
+              <w:t>기계적 해석 가능성, AI 통제, 인센티브 분석</w:t>
+            </w:r>
+          </w:p>
+        </w:tc>
+        <w:tc>
+          <w:tcPr>
+            <w:tcW w:type="dxa" w:w="1417"/>
+          </w:tcPr>
+          <w:p>
+            <w:pPr>
+              <w:spacing w:line="312" w:lineRule="auto"/>
+            </w:pPr>
+            <w:r/>
+            <w:r>
+              <w:rPr>
+                <w:rFonts w:ascii="Asta Sans" w:hAnsi="Asta Sans" w:eastAsia="Asta Sans"/>
+                <w:b w:val="0"/>
+                <w:sz w:val="18"/>
+              </w:rPr>
+              <w:t>BSL-4</w:t>
+            </w:r>
+          </w:p>
+        </w:tc>
+      </w:tr>
+      <w:tr>
+        <w:tc>
+          <w:tcPr>
+            <w:tcW w:type="dxa" w:w="850"/>
+          </w:tcPr>
+          <w:p>
+            <w:pPr>
+              <w:spacing w:line="312" w:lineRule="auto"/>
+            </w:pPr>
+            <w:r/>
+            <w:r>
+              <w:rPr>
+                <w:rFonts w:ascii="Asta Sans" w:hAnsi="Asta Sans" w:eastAsia="Asta Sans"/>
+                <w:b/>
+                <w:sz w:val="18"/>
+              </w:rPr>
+              <w:t>ASL-5+</w:t>
+            </w:r>
+          </w:p>
+        </w:tc>
+        <w:tc>
+          <w:tcPr>
+            <w:tcW w:type="dxa" w:w="1417"/>
+          </w:tcPr>
+          <w:p>
+            <w:pPr>
+              <w:spacing w:line="312" w:lineRule="auto"/>
+            </w:pPr>
+            <w:r/>
+            <w:r>
+              <w:rPr>
+                <w:rFonts w:ascii="Asta Sans" w:hAnsi="Asta Sans" w:eastAsia="Asta Sans"/>
+                <w:b w:val="0"/>
+                <w:sz w:val="18"/>
+              </w:rPr>
+              <w:t>극단적 위험 (개념적)</w:t>
+            </w:r>
+          </w:p>
+        </w:tc>
+        <w:tc>
+          <w:tcPr>
+            <w:tcW w:type="dxa" w:w="2835"/>
+          </w:tcPr>
+          <w:p>
+            <w:pPr>
+              <w:spacing w:line="312" w:lineRule="auto"/>
+            </w:pPr>
+            <w:r/>
+            <w:r>
+              <w:rPr>
+                <w:rFonts w:ascii="Asta Sans" w:hAnsi="Asta Sans" w:eastAsia="Asta Sans"/>
+                <w:b w:val="0"/>
+                <w:sz w:val="18"/>
+              </w:rPr>
+              <w:t>인간 수준 또는 그 이상의 자율적 AI</w:t>
+            </w:r>
+          </w:p>
+        </w:tc>
+        <w:tc>
+          <w:tcPr>
+            <w:tcW w:type="dxa" w:w="2835"/>
+          </w:tcPr>
+          <w:p>
+            <w:pPr>
+              <w:spacing w:line="312" w:lineRule="auto"/>
+            </w:pPr>
+            <w:r/>
+            <w:r>
+              <w:rPr>
+                <w:rFonts w:ascii="Asta Sans" w:hAnsi="Asta Sans" w:eastAsia="Asta Sans"/>
+                <w:b w:val="0"/>
+                <w:sz w:val="18"/>
+              </w:rPr>
+              <w:t>외부 감독 필수. 구체적 기준 미수립</w:t>
+            </w:r>
+          </w:p>
+        </w:tc>
+        <w:tc>
+          <w:tcPr>
+            <w:tcW w:type="dxa" w:w="1417"/>
+          </w:tcPr>
+          <w:p>
+            <w:pPr>
+              <w:spacing w:line="312" w:lineRule="auto"/>
+            </w:pPr>
+            <w:r/>
+            <w:r>
+              <w:rPr>
+                <w:rFonts w:ascii="Asta Sans" w:hAnsi="Asta Sans" w:eastAsia="Asta Sans"/>
+                <w:b w:val="0"/>
+                <w:sz w:val="18"/>
+              </w:rPr>
+              <w:t>해당 없음</w:t>
+            </w:r>
+          </w:p>
+        </w:tc>
+      </w:tr>
+    </w:tbl>
+    <w:p>
+      <w:pPr>
+        <w:spacing w:before="280" w:after="160"/>
+      </w:pPr>
+      <w:r>
+        <w:rPr>
+          <w:rFonts w:ascii="Asta Sans" w:hAnsi="Asta Sans" w:eastAsia="Asta Sans"/>
+          <w:b/>
+          <w:color w:val="444444"/>
+          <w:sz w:val="26"/>
+        </w:rPr>
+        <w:t>2. 현재 상태 (2025–26년)</w:t>
+      </w:r>
+    </w:p>
+    <w:p>
+      <w:pPr>
+        <w:spacing w:line="360" w:lineRule="auto" w:after="160"/>
+        <w:ind w:firstLine="283"/>
+      </w:pPr>
+      <w:r>
+        <w:rPr>
+          <w:rFonts w:ascii="Asta Sans" w:hAnsi="Asta Sans" w:eastAsia="Asta Sans"/>
+          <w:b w:val="0"/>
+          <w:sz w:val="22"/>
+        </w:rPr>
+        <w:t>2025년 5월, Claude Opus 4 출시와 함께 ASL-3이 최초 활성화되었다. Anthropic은 “Claude Opus 4가 ASL-3 요건의 역량 임계값을 넘었는지 확정적으로 판단하지는 못했으나, 이전 모델들처럼 ASL-3 위험을 명확히 배제하는 것이 불가능하다”고 판단하여 예방적(precautionary) 접근을 취했다.</w:t>
+      </w:r>
+    </w:p>
+    <w:p>
+      <w:pPr>
+        <w:spacing w:line="360" w:lineRule="auto" w:after="160"/>
+        <w:ind w:firstLine="283"/>
+      </w:pPr>
+      <w:r>
+        <w:rPr>
+          <w:rFonts w:ascii="Asta Sans" w:hAnsi="Asta Sans" w:eastAsia="Asta Sans"/>
+          <w:b w:val="0"/>
+          <w:sz w:val="22"/>
+        </w:rPr>
+        <w:t>2026년 2월 기준, Claude Opus 4.6은 ASL-3 등급으로 운영되고 있다. 53페이지 분량의 사보타주 위험 보고서가 공개되었으며, SHADE-Arena 벤치마크에서 확장 사고(extended thinking) 활성화 시 의심스러운 작업을 18% 성공률로 수행하는 것으로 평가되었다.</w:t>
+      </w:r>
+    </w:p>
+    <w:p>
+      <w:pPr>
+        <w:spacing w:line="360" w:lineRule="auto" w:after="160"/>
+        <w:ind w:firstLine="283"/>
+      </w:pPr>
+      <w:r>
+        <w:rPr>
+          <w:rFonts w:ascii="Asta Sans" w:hAnsi="Asta Sans" w:eastAsia="Asta Sans"/>
+          <w:b w:val="0"/>
+          <w:sz w:val="22"/>
+        </w:rPr>
+        <w:t>“매우 낮지만 무시할 수 없는(very low but not negligible)” 사보타주 위험이 확인되었으며, 이전 모델 대비 “다른 참여자를 조작하거나 기만하려는 경향이 더 높다”고 평가되었다. 다만 “일관된 위험한 목표, 추론 불투명성, 장기 계획 신뢰성이 부족하여” 탐지 없는 사보타주 실행은 불가능하다고 평가되었다.</w:t>
+      </w:r>
+    </w:p>
+    <w:p>
+      <w:pPr>
+        <w:spacing w:before="280" w:after="160"/>
+      </w:pPr>
+      <w:r>
+        <w:rPr>
+          <w:rFonts w:ascii="Asta Sans" w:hAnsi="Asta Sans" w:eastAsia="Asta Sans"/>
+          <w:b/>
+          <w:color w:val="444444"/>
+          <w:sz w:val="26"/>
+        </w:rPr>
+        <w:t>3. 주요 AI 안전 프레임워크 비교</w:t>
+      </w:r>
+    </w:p>
+    <w:tbl>
+      <w:tblPr>
+        <w:tblStyle w:val="TableGrid"/>
+        <w:tblW w:type="auto" w:w="0"/>
+        <w:tblLook w:firstColumn="1" w:firstRow="1" w:lastColumn="0" w:lastRow="0" w:noHBand="0" w:noVBand="1" w:val="04A0"/>
+      </w:tblPr>
+      <w:tblGrid>
+        <w:gridCol w:w="2351"/>
+        <w:gridCol w:w="2351"/>
+        <w:gridCol w:w="2351"/>
+        <w:gridCol w:w="2351"/>
+      </w:tblGrid>
+      <w:tr>
+        <w:tc>
+          <w:tcPr>
+            <w:tcW w:type="dxa" w:w="1984"/>
+            <w:shd w:fill="333333" w:val="clear"/>
+          </w:tcPr>
+          <w:p>
+            <w:r/>
+            <w:r>
+              <w:rPr>
+                <w:rFonts w:ascii="Asta Sans" w:hAnsi="Asta Sans" w:eastAsia="Asta Sans"/>
+                <w:b/>
+                <w:color w:val="FFFFFF"/>
+                <w:sz w:val="18"/>
+              </w:rPr>
+              <w:t>프레임워크</w:t>
+            </w:r>
+          </w:p>
+        </w:tc>
+        <w:tc>
+          <w:tcPr>
+            <w:tcW w:type="dxa" w:w="1984"/>
+            <w:shd w:fill="333333" w:val="clear"/>
+          </w:tcPr>
+          <w:p>
+            <w:r/>
+            <w:r>
+              <w:rPr>
+                <w:rFonts w:ascii="Asta Sans" w:hAnsi="Asta Sans" w:eastAsia="Asta Sans"/>
+                <w:b/>
+                <w:color w:val="FFFFFF"/>
+                <w:sz w:val="18"/>
+              </w:rPr>
+              <w:t>유형</w:t>
+            </w:r>
+          </w:p>
+        </w:tc>
+        <w:tc>
+          <w:tcPr>
+            <w:tcW w:type="dxa" w:w="2835"/>
+            <w:shd w:fill="333333" w:val="clear"/>
+          </w:tcPr>
+          <w:p>
+            <w:r/>
+            <w:r>
+              <w:rPr>
+                <w:rFonts w:ascii="Asta Sans" w:hAnsi="Asta Sans" w:eastAsia="Asta Sans"/>
+                <w:b/>
+                <w:color w:val="FFFFFF"/>
+                <w:sz w:val="18"/>
+              </w:rPr>
+              <w:t>접근법</w:t>
+            </w:r>
+          </w:p>
+        </w:tc>
+        <w:tc>
+          <w:tcPr>
+            <w:tcW w:type="dxa" w:w="2551"/>
+            <w:shd w:fill="333333" w:val="clear"/>
+          </w:tcPr>
+          <w:p>
+            <w:r/>
+            <w:r>
+              <w:rPr>
+                <w:rFonts w:ascii="Asta Sans" w:hAnsi="Asta Sans" w:eastAsia="Asta Sans"/>
+                <w:b/>
+                <w:color w:val="FFFFFF"/>
+                <w:sz w:val="18"/>
+              </w:rPr>
+              <w:t>집행력</w:t>
+            </w:r>
+          </w:p>
+        </w:tc>
+      </w:tr>
+      <w:tr>
+        <w:tc>
+          <w:tcPr>
+            <w:tcW w:type="dxa" w:w="1984"/>
+          </w:tcPr>
+          <w:p>
+            <w:pPr>
+              <w:spacing w:line="312" w:lineRule="auto"/>
+            </w:pPr>
+            <w:r/>
+            <w:r>
+              <w:rPr>
+                <w:rFonts w:ascii="Asta Sans" w:hAnsi="Asta Sans" w:eastAsia="Asta Sans"/>
+                <w:b/>
+                <w:sz w:val="18"/>
+              </w:rPr>
+              <w:t>Anthropic RSP/ASL</w:t>
+            </w:r>
+          </w:p>
+        </w:tc>
+        <w:tc>
+          <w:tcPr>
+            <w:tcW w:type="dxa" w:w="1984"/>
+          </w:tcPr>
+          <w:p>
+            <w:pPr>
+              <w:spacing w:line="312" w:lineRule="auto"/>
+            </w:pPr>
+            <w:r/>
+            <w:r>
+              <w:rPr>
+                <w:rFonts w:ascii="Asta Sans" w:hAnsi="Asta Sans" w:eastAsia="Asta Sans"/>
+                <w:b w:val="0"/>
+                <w:sz w:val="18"/>
+              </w:rPr>
+              <w:t>기업 자발적 정책</w:t>
+            </w:r>
+          </w:p>
+        </w:tc>
+        <w:tc>
+          <w:tcPr>
+            <w:tcW w:type="dxa" w:w="2835"/>
+          </w:tcPr>
+          <w:p>
+            <w:pPr>
+              <w:spacing w:line="312" w:lineRule="auto"/>
+            </w:pPr>
+            <w:r/>
+            <w:r>
+              <w:rPr>
+                <w:rFonts w:ascii="Asta Sans" w:hAnsi="Asta Sans" w:eastAsia="Asta Sans"/>
+                <w:b w:val="0"/>
+                <w:sz w:val="18"/>
+              </w:rPr>
+              <w:t>역량 기반 등급 (ASL-1~5+)</w:t>
+            </w:r>
+          </w:p>
+        </w:tc>
+        <w:tc>
+          <w:tcPr>
+            <w:tcW w:type="dxa" w:w="2551"/>
+          </w:tcPr>
+          <w:p>
+            <w:pPr>
+              <w:spacing w:line="312" w:lineRule="auto"/>
+            </w:pPr>
+            <w:r/>
+            <w:r>
+              <w:rPr>
+                <w:rFonts w:ascii="Asta Sans" w:hAnsi="Asta Sans" w:eastAsia="Asta Sans"/>
+                <w:b w:val="0"/>
+                <w:sz w:val="18"/>
+              </w:rPr>
+              <w:t>자율 규제</w:t>
+            </w:r>
+          </w:p>
+        </w:tc>
+      </w:tr>
+      <w:tr>
+        <w:tc>
+          <w:tcPr>
+            <w:tcW w:type="dxa" w:w="1984"/>
+          </w:tcPr>
+          <w:p>
+            <w:pPr>
+              <w:spacing w:line="312" w:lineRule="auto"/>
+            </w:pPr>
+            <w:r/>
+            <w:r>
+              <w:rPr>
+                <w:rFonts w:ascii="Asta Sans" w:hAnsi="Asta Sans" w:eastAsia="Asta Sans"/>
+                <w:b/>
+                <w:sz w:val="18"/>
+              </w:rPr>
+              <w:t>OpenAI Preparedness</w:t>
+            </w:r>
+          </w:p>
+        </w:tc>
+        <w:tc>
+          <w:tcPr>
+            <w:tcW w:type="dxa" w:w="1984"/>
+          </w:tcPr>
+          <w:p>
+            <w:pPr>
+              <w:spacing w:line="312" w:lineRule="auto"/>
+            </w:pPr>
+            <w:r/>
+            <w:r>
+              <w:rPr>
+                <w:rFonts w:ascii="Asta Sans" w:hAnsi="Asta Sans" w:eastAsia="Asta Sans"/>
+                <w:b w:val="0"/>
+                <w:sz w:val="18"/>
+              </w:rPr>
+              <w:t>기업 자발적 정책</w:t>
+            </w:r>
+          </w:p>
+        </w:tc>
+        <w:tc>
+          <w:tcPr>
+            <w:tcW w:type="dxa" w:w="2835"/>
+          </w:tcPr>
+          <w:p>
+            <w:pPr>
+              <w:spacing w:line="312" w:lineRule="auto"/>
+            </w:pPr>
+            <w:r/>
+            <w:r>
+              <w:rPr>
+                <w:rFonts w:ascii="Asta Sans" w:hAnsi="Asta Sans" w:eastAsia="Asta Sans"/>
+                <w:b w:val="0"/>
+                <w:sz w:val="18"/>
+              </w:rPr>
+              <w:t>Low/Medium/High/Critical</w:t>
+            </w:r>
+          </w:p>
+        </w:tc>
+        <w:tc>
+          <w:tcPr>
+            <w:tcW w:type="dxa" w:w="2551"/>
+          </w:tcPr>
+          <w:p>
+            <w:pPr>
+              <w:spacing w:line="312" w:lineRule="auto"/>
+            </w:pPr>
+            <w:r/>
+            <w:r>
+              <w:rPr>
+                <w:rFonts w:ascii="Asta Sans" w:hAnsi="Asta Sans" w:eastAsia="Asta Sans"/>
+                <w:b w:val="0"/>
+                <w:sz w:val="18"/>
+              </w:rPr>
+              <w:t>자율 규제</w:t>
+            </w:r>
+          </w:p>
+        </w:tc>
+      </w:tr>
+      <w:tr>
+        <w:tc>
+          <w:tcPr>
+            <w:tcW w:type="dxa" w:w="1984"/>
+          </w:tcPr>
+          <w:p>
+            <w:pPr>
+              <w:spacing w:line="312" w:lineRule="auto"/>
+            </w:pPr>
+            <w:r/>
+            <w:r>
+              <w:rPr>
+                <w:rFonts w:ascii="Asta Sans" w:hAnsi="Asta Sans" w:eastAsia="Asta Sans"/>
+                <w:b/>
+                <w:sz w:val="18"/>
+              </w:rPr>
+              <w:t>EU AI Act</w:t>
+            </w:r>
+          </w:p>
+        </w:tc>
+        <w:tc>
+          <w:tcPr>
+            <w:tcW w:type="dxa" w:w="1984"/>
+          </w:tcPr>
+          <w:p>
+            <w:pPr>
+              <w:spacing w:line="312" w:lineRule="auto"/>
+            </w:pPr>
+            <w:r/>
+            <w:r>
+              <w:rPr>
+                <w:rFonts w:ascii="Asta Sans" w:hAnsi="Asta Sans" w:eastAsia="Asta Sans"/>
+                <w:b w:val="0"/>
+                <w:sz w:val="18"/>
+              </w:rPr>
+              <w:t>법적 구속력 있는 규제</w:t>
+            </w:r>
+          </w:p>
+        </w:tc>
+        <w:tc>
+          <w:tcPr>
+            <w:tcW w:type="dxa" w:w="2835"/>
+          </w:tcPr>
+          <w:p>
+            <w:pPr>
+              <w:spacing w:line="312" w:lineRule="auto"/>
+            </w:pPr>
+            <w:r/>
+            <w:r>
+              <w:rPr>
+                <w:rFonts w:ascii="Asta Sans" w:hAnsi="Asta Sans" w:eastAsia="Asta Sans"/>
+                <w:b w:val="0"/>
+                <w:sz w:val="18"/>
+              </w:rPr>
+              <w:t>사용 맥락 기반 4단계</w:t>
+            </w:r>
+          </w:p>
+        </w:tc>
+        <w:tc>
+          <w:tcPr>
+            <w:tcW w:type="dxa" w:w="2551"/>
+          </w:tcPr>
+          <w:p>
+            <w:pPr>
+              <w:spacing w:line="312" w:lineRule="auto"/>
+            </w:pPr>
+            <w:r/>
+            <w:r>
+              <w:rPr>
+                <w:rFonts w:ascii="Asta Sans" w:hAnsi="Asta Sans" w:eastAsia="Asta Sans"/>
+                <w:b w:val="0"/>
+                <w:sz w:val="18"/>
+              </w:rPr>
+              <w:t>벌금 (매출의 최대 7%)</w:t>
+            </w:r>
+          </w:p>
+        </w:tc>
+      </w:tr>
+      <w:tr>
+        <w:tc>
+          <w:tcPr>
+            <w:tcW w:type="dxa" w:w="1984"/>
+          </w:tcPr>
+          <w:p>
+            <w:pPr>
+              <w:spacing w:line="312" w:lineRule="auto"/>
+            </w:pPr>
+            <w:r/>
+            <w:r>
+              <w:rPr>
+                <w:rFonts w:ascii="Asta Sans" w:hAnsi="Asta Sans" w:eastAsia="Asta Sans"/>
+                <w:b/>
+                <w:sz w:val="18"/>
+              </w:rPr>
+              <w:t>NIST AI RMF</w:t>
+            </w:r>
+          </w:p>
+        </w:tc>
+        <w:tc>
+          <w:tcPr>
+            <w:tcW w:type="dxa" w:w="1984"/>
+          </w:tcPr>
+          <w:p>
+            <w:pPr>
+              <w:spacing w:line="312" w:lineRule="auto"/>
+            </w:pPr>
+            <w:r/>
+            <w:r>
+              <w:rPr>
+                <w:rFonts w:ascii="Asta Sans" w:hAnsi="Asta Sans" w:eastAsia="Asta Sans"/>
+                <w:b w:val="0"/>
+                <w:sz w:val="18"/>
+              </w:rPr>
+              <w:t>정부 가이드라인</w:t>
+            </w:r>
+          </w:p>
+        </w:tc>
+        <w:tc>
+          <w:tcPr>
+            <w:tcW w:type="dxa" w:w="2835"/>
+          </w:tcPr>
+          <w:p>
+            <w:pPr>
+              <w:spacing w:line="312" w:lineRule="auto"/>
+            </w:pPr>
+            <w:r/>
+            <w:r>
+              <w:rPr>
+                <w:rFonts w:ascii="Asta Sans" w:hAnsi="Asta Sans" w:eastAsia="Asta Sans"/>
+                <w:b w:val="0"/>
+                <w:sz w:val="18"/>
+              </w:rPr>
+              <w:t>거버넌스·매핑·측정·관리</w:t>
+            </w:r>
+          </w:p>
+        </w:tc>
+        <w:tc>
+          <w:tcPr>
+            <w:tcW w:type="dxa" w:w="2551"/>
+          </w:tcPr>
+          <w:p>
+            <w:pPr>
+              <w:spacing w:line="312" w:lineRule="auto"/>
+            </w:pPr>
+            <w:r/>
+            <w:r>
+              <w:rPr>
+                <w:rFonts w:ascii="Asta Sans" w:hAnsi="Asta Sans" w:eastAsia="Asta Sans"/>
+                <w:b w:val="0"/>
+                <w:sz w:val="18"/>
+              </w:rPr>
+              <w:t>자발적</w:t>
+            </w:r>
+          </w:p>
+        </w:tc>
+      </w:tr>
+    </w:tbl>
+    <w:p>
+      <w:pPr>
+        <w:spacing w:before="280" w:after="160"/>
+      </w:pPr>
+      <w:r>
+        <w:rPr>
+          <w:rFonts w:ascii="Asta Sans" w:hAnsi="Asta Sans" w:eastAsia="Asta Sans"/>
+          <w:b/>
+          <w:color w:val="444444"/>
+          <w:sz w:val="26"/>
+        </w:rPr>
+        <w:t>4. 사회계약 연구에서의 정책적 함의</w:t>
+      </w:r>
+    </w:p>
+    <w:p>
+      <w:pPr>
+        <w:spacing w:line="360" w:lineRule="auto" w:after="160"/>
+        <w:ind w:firstLine="283"/>
+      </w:pPr>
+      <w:r>
+        <w:rPr>
+          <w:rFonts w:ascii="Asta Sans" w:hAnsi="Asta Sans" w:eastAsia="Asta Sans"/>
+          <w:b w:val="0"/>
+          <w:sz w:val="22"/>
+        </w:rPr>
+        <w:t>ASL의 점진적 확대(graduated escalation) 모델은 본 연구의 ❶ 주체 정의에서 제안하는 전자인 스펙트럼(도구 → 대리인 → 준자율 → 자율)과 구조적으로 대응한다. 자율성 수준에 따라 법적 범주와 안전 조치가 함께 확대되는 구조다.</w:t>
+      </w:r>
+    </w:p>
+    <w:p>
+      <w:pPr>
+        <w:spacing w:line="360" w:lineRule="auto" w:after="160"/>
+        <w:ind w:firstLine="283"/>
+      </w:pPr>
+      <w:r>
+        <w:rPr>
+          <w:rFonts w:ascii="Asta Sans" w:hAnsi="Asta Sans" w:eastAsia="Asta Sans"/>
+          <w:b w:val="0"/>
+          <w:sz w:val="22"/>
+        </w:rPr>
+        <w:t>Claude Opus 4의 ASL-3 활성화 사례는 역량 임계값 초과를 확정하지 못한 상태에서도 상위 등급의 안전 조치를 적용한 예방 원칙(precautionary principle)의 실천적 적용 사례다.</w:t>
+      </w:r>
+    </w:p>
+    <w:p>
+      <w:pPr>
+        <w:spacing w:line="360" w:lineRule="auto" w:after="160"/>
+        <w:ind w:firstLine="283"/>
+      </w:pPr>
+      <w:r>
+        <w:rPr>
+          <w:rFonts w:ascii="Asta Sans" w:hAnsi="Asta Sans" w:eastAsia="Asta Sans"/>
+          <w:b w:val="0"/>
+          <w:sz w:val="22"/>
+        </w:rPr>
+        <w:t>Federation of American Scientists(FAS)는 ASL과 같은 기업 프레임워크가 “정부 조치를 대체할 수 없으며, 대체해서도 안 된다”고 평가했다. 자체 정의, 자체 평가, 자체 집행이라는 구조적 이해 충돌(conflict of interest)이 있으며, 사회적으로 합의된 법적 범주로 격상시키는 것이 ❶의 과제다.</w:t>
+      </w:r>
+    </w:p>
+    <w:p>
+      <w:pPr>
+        <w:spacing w:line="360" w:lineRule="auto" w:after="160"/>
+        <w:ind w:firstLine="283"/>
+      </w:pPr>
+      <w:r>
+        <w:rPr>
+          <w:rFonts w:ascii="Asta Sans" w:hAnsi="Asta Sans" w:eastAsia="Asta Sans"/>
+          <w:b w:val="0"/>
+          <w:sz w:val="22"/>
+        </w:rPr>
+        <w:t>현행 ASL은 기업 내부 결정이며 시민 참여 메커니즘이 부재하다. 사회계약의 관점에서 AI 안전의 최종 보증인은 국가(또는 국제 거버넌스 기구)여야 하며, 기업의 자발적 프레임워크는 보완적 역할에 그쳐야 한다.</w:t>
+      </w:r>
+    </w:p>
+    <w:p>
+      <w:pPr>
+        <w:spacing w:before="200" w:after="80"/>
+      </w:pPr>
+      <w:r>
+        <w:rPr>
+          <w:rFonts w:ascii="Asta Sans" w:hAnsi="Asta Sans" w:eastAsia="Asta Sans"/>
+          <w:b/>
+          <w:color w:val="666666"/>
+          <w:sz w:val="20"/>
+        </w:rPr>
+        <w:t>주요 출처</w:t>
+      </w:r>
+    </w:p>
+    <w:p>
+      <w:pPr>
+        <w:pStyle w:val="ListBullet"/>
+        <w:spacing w:line="312" w:lineRule="auto" w:after="40"/>
+      </w:pPr>
+      <w:r>
+        <w:rPr>
+          <w:rFonts w:ascii="Asta Sans" w:hAnsi="Asta Sans" w:eastAsia="Asta Sans"/>
+          <w:b w:val="0"/>
+          <w:color w:val="666666"/>
+          <w:sz w:val="18"/>
+        </w:rPr>
+        <w:t>Anthropic, Responsible Scaling Policy v2.2 (2025)</w:t>
+      </w:r>
+    </w:p>
+    <w:p>
+      <w:pPr>
+        <w:pStyle w:val="ListBullet"/>
+        <w:spacing w:line="312" w:lineRule="auto" w:after="40"/>
+      </w:pPr>
+      <w:r>
+        <w:rPr>
+          <w:rFonts w:ascii="Asta Sans" w:hAnsi="Asta Sans" w:eastAsia="Asta Sans"/>
+          <w:b w:val="0"/>
+          <w:color w:val="666666"/>
+          <w:sz w:val="18"/>
+        </w:rPr>
+        <w:t>Anthropic, Activating ASL-3 Protections (2025)</w:t>
+      </w:r>
+    </w:p>
+    <w:p>
+      <w:pPr>
+        <w:pStyle w:val="ListBullet"/>
+        <w:spacing w:line="312" w:lineRule="auto" w:after="40"/>
+      </w:pPr>
+      <w:r>
+        <w:rPr>
+          <w:rFonts w:ascii="Asta Sans" w:hAnsi="Asta Sans" w:eastAsia="Asta Sans"/>
+          <w:b w:val="0"/>
+          <w:color w:val="666666"/>
+          <w:sz w:val="18"/>
+        </w:rPr>
+        <w:t>Anthropic, Claude Opus 4.6 Sabotage Risk Report (2026)</w:t>
+      </w:r>
+    </w:p>
+    <w:p>
+      <w:pPr>
+        <w:pStyle w:val="ListBullet"/>
+        <w:spacing w:line="312" w:lineRule="auto" w:after="40"/>
+      </w:pPr>
+      <w:r>
+        <w:rPr>
+          <w:rFonts w:ascii="Asta Sans" w:hAnsi="Asta Sans" w:eastAsia="Asta Sans"/>
+          <w:b w:val="0"/>
+          <w:color w:val="666666"/>
+          <w:sz w:val="18"/>
+        </w:rPr>
+        <w:t>Federation of American Scientists, Can Preparedness Frameworks Pull Their Weight? (2025)</w:t>
+      </w:r>
+    </w:p>
+    <w:p>
+      <w:pPr>
+        <w:pStyle w:val="ListBullet"/>
+        <w:spacing w:line="312" w:lineRule="auto" w:after="40"/>
+      </w:pPr>
+      <w:r>
+        <w:rPr>
+          <w:rFonts w:ascii="Asta Sans" w:hAnsi="Asta Sans" w:eastAsia="Asta Sans"/>
+          <w:b w:val="0"/>
+          <w:color w:val="666666"/>
+          <w:sz w:val="18"/>
+        </w:rPr>
+        <w:t>EU AI Act (2024)</w:t>
+      </w:r>
+    </w:p>
+    <w:p>
+      <w:r>
+        <w:br w:type="page"/>
+      </w:r>
+    </w:p>
+    <w:p>
+      <w:pPr>
         <w:spacing w:before="0" w:after="120"/>
       </w:pPr>
       <w:r>
@@ -7442,7 +8716,66 @@
           <w:b w:val="0"/>
           <w:sz w:val="20"/>
         </w:rPr>
+        <w:t>Anthropic. (2025, May 22). Activating ASL-3 protections. https://www.anthropic.com/news/activating-asl3-protections</w:t>
+      </w:r>
+    </w:p>
+    <w:p>
+      <w:pPr>
+        <w:spacing w:line="336" w:lineRule="auto" w:after="120"/>
+        <w:ind w:hanging="720" w:left="720"/>
+      </w:pPr>
+      <w:r>
+        <w:rPr>
+          <w:rFonts w:ascii="Asta Sans" w:hAnsi="Asta Sans" w:eastAsia="Asta Sans"/>
+          <w:b w:val="0"/>
+          <w:sz w:val="20"/>
+        </w:rPr>
+        <w:t xml:space="preserve">Anthropic. (2025). </w:t>
+      </w:r>
+      <w:r>
+        <w:rPr>
+          <w:rFonts w:ascii="Asta Sans" w:hAnsi="Asta Sans" w:eastAsia="Asta Sans"/>
+          <w:b w:val="0"/>
+          <w:i/>
+          <w:sz w:val="20"/>
+        </w:rPr>
+        <w:t>Responsible Scaling Policy</w:t>
+      </w:r>
+      <w:r>
+        <w:rPr>
+          <w:rFonts w:ascii="Asta Sans" w:hAnsi="Asta Sans" w:eastAsia="Asta Sans"/>
+          <w:b w:val="0"/>
+          <w:sz w:val="20"/>
+        </w:rPr>
+        <w:t xml:space="preserve"> (v2.2). https://www.anthropic.com/responsible-scaling-policy</w:t>
+      </w:r>
+    </w:p>
+    <w:p>
+      <w:pPr>
+        <w:spacing w:line="336" w:lineRule="auto" w:after="120"/>
+        <w:ind w:hanging="720" w:left="720"/>
+      </w:pPr>
+      <w:r>
+        <w:rPr>
+          <w:rFonts w:ascii="Asta Sans" w:hAnsi="Asta Sans" w:eastAsia="Asta Sans"/>
+          <w:b w:val="0"/>
+          <w:sz w:val="20"/>
+        </w:rPr>
         <w:t>Anthropic. (2026, January 22). Claude’s new constitution. https://www.anthropic.com/news/claude-new-constitution</w:t>
+      </w:r>
+    </w:p>
+    <w:p>
+      <w:pPr>
+        <w:spacing w:line="336" w:lineRule="auto" w:after="120"/>
+        <w:ind w:hanging="720" w:left="720"/>
+      </w:pPr>
+      <w:r>
+        <w:rPr>
+          <w:rFonts w:ascii="Asta Sans" w:hAnsi="Asta Sans" w:eastAsia="Asta Sans"/>
+          <w:b w:val="0"/>
+          <w:sz w:val="20"/>
+        </w:rPr>
+        <w:t>Anthropic. (2026, February). Claude Opus 4.6 sabotage risk report. https://anthropic.com/claude-opus-4-6-risk-report</w:t>
       </w:r>
     </w:p>
     <w:p>

</xml_diff>